<commit_message>
Week 3 Gate 3
</commit_message>
<xml_diff>
--- a/SeleniumWeek3Assessment/Demo Report.docx
+++ b/SeleniumWeek3Assessment/Demo Report.docx
@@ -5,13 +5,6 @@
     <w:p>
       <w:pPr>
         <w:rPr>
-          <w:lang w:val="en-US"/>
-        </w:rPr>
-      </w:pPr>
-    </w:p>
-    <w:p>
-      <w:pPr>
-        <w:rPr>
           <w:b/>
           <w:bCs/>
           <w:sz w:val="44"/>
@@ -136,25 +129,7 @@
           <w:bCs/>
           <w:lang w:val="en-US"/>
         </w:rPr>
-        <w:t xml:space="preserve">Variables </w:t>
-      </w:r>
-      <w:proofErr w:type="gramStart"/>
-      <w:r>
-        <w:rPr>
-          <w:b/>
-          <w:bCs/>
-          <w:lang w:val="en-US"/>
-        </w:rPr>
-        <w:t>in .env</w:t>
-      </w:r>
-      <w:proofErr w:type="gramEnd"/>
-      <w:r>
-        <w:rPr>
-          <w:b/>
-          <w:bCs/>
-          <w:lang w:val="en-US"/>
-        </w:rPr>
-        <w:t>:</w:t>
+        <w:t>Variables in .env:</w:t>
       </w:r>
     </w:p>
     <w:p>
@@ -249,63 +224,11 @@
         </w:rPr>
         <w:t xml:space="preserve">Command to run: </w:t>
       </w:r>
-      <w:proofErr w:type="spellStart"/>
-      <w:r>
-        <w:rPr>
-          <w:lang w:val="en-US"/>
-        </w:rPr>
-        <w:t>mvn</w:t>
-      </w:r>
-      <w:proofErr w:type="spellEnd"/>
-      <w:r>
-        <w:rPr>
-          <w:lang w:val="en-US"/>
-        </w:rPr>
-        <w:t xml:space="preserve"> test -</w:t>
-      </w:r>
-      <w:proofErr w:type="spellStart"/>
-      <w:r>
-        <w:rPr>
-          <w:lang w:val="en-US"/>
-        </w:rPr>
-        <w:t>Dtest</w:t>
-      </w:r>
-      <w:proofErr w:type="spellEnd"/>
-      <w:r>
-        <w:rPr>
-          <w:lang w:val="en-US"/>
-        </w:rPr>
-        <w:t>=</w:t>
-      </w:r>
-      <w:proofErr w:type="spellStart"/>
-      <w:r>
-        <w:rPr>
-          <w:lang w:val="en-US"/>
-        </w:rPr>
-        <w:t>RunCucumberTest</w:t>
-      </w:r>
-      <w:proofErr w:type="spellEnd"/>
-      <w:r>
-        <w:rPr>
-          <w:lang w:val="en-US"/>
-        </w:rPr>
-        <w:t xml:space="preserve"> -</w:t>
-      </w:r>
-      <w:proofErr w:type="spellStart"/>
-      <w:proofErr w:type="gramStart"/>
-      <w:r>
-        <w:rPr>
-          <w:lang w:val="en-US"/>
-        </w:rPr>
-        <w:t>Dcucumber.filter.tags</w:t>
-      </w:r>
-      <w:proofErr w:type="spellEnd"/>
-      <w:proofErr w:type="gramEnd"/>
-      <w:r>
-        <w:rPr>
-          <w:lang w:val="en-US"/>
-        </w:rPr>
-        <w:t>=@smoke</w:t>
+      <w:r>
+        <w:rPr>
+          <w:lang w:val="en-US"/>
+        </w:rPr>
+        <w:t>mvn test -Dtest=RunCucumberTest -Dcucumber.filter.tags=@smoke</w:t>
       </w:r>
     </w:p>
     <w:p>
@@ -321,23 +244,13 @@
           <w:lang w:val="en-US"/>
         </w:rPr>
       </w:pPr>
-      <w:proofErr w:type="gramStart"/>
-      <w:r>
-        <w:rPr>
-          <w:b/>
-          <w:bCs/>
-          <w:lang w:val="en-US"/>
-        </w:rPr>
-        <w:t>Buy</w:t>
-      </w:r>
-      <w:proofErr w:type="gramEnd"/>
-      <w:r>
-        <w:rPr>
-          <w:b/>
-          <w:bCs/>
-          <w:lang w:val="en-US"/>
-        </w:rPr>
-        <w:t xml:space="preserve"> a single product end to end</w:t>
+      <w:r>
+        <w:rPr>
+          <w:b/>
+          <w:bCs/>
+          <w:lang w:val="en-US"/>
+        </w:rPr>
+        <w:t>Buy a single product end to end</w:t>
       </w:r>
     </w:p>
     <w:p>
@@ -421,21 +334,7 @@
         <w:rPr>
           <w:lang w:val="en-US"/>
         </w:rPr>
-        <w:t xml:space="preserve">        And I </w:t>
-      </w:r>
-      <w:proofErr w:type="gramStart"/>
-      <w:r>
-        <w:rPr>
-          <w:lang w:val="en-US"/>
-        </w:rPr>
-        <w:t>add</w:t>
-      </w:r>
-      <w:proofErr w:type="gramEnd"/>
-      <w:r>
-        <w:rPr>
-          <w:lang w:val="en-US"/>
-        </w:rPr>
-        <w:t xml:space="preserve"> the first item to the cart</w:t>
+        <w:t xml:space="preserve">        And I add the first item to the cart</w:t>
       </w:r>
     </w:p>
     <w:p>
@@ -507,6 +406,26 @@
         </w:rPr>
         <w:t xml:space="preserve">        Then the order is confirmed</w:t>
       </w:r>
+    </w:p>
+    <w:p>
+      <w:pPr>
+        <w:pStyle w:val="ListParagraph"/>
+        <w:rPr>
+          <w:b/>
+          <w:bCs/>
+          <w:lang w:val="en-US"/>
+        </w:rPr>
+      </w:pPr>
+    </w:p>
+    <w:p>
+      <w:pPr>
+        <w:pStyle w:val="ListParagraph"/>
+        <w:rPr>
+          <w:b/>
+          <w:bCs/>
+          <w:lang w:val="en-US"/>
+        </w:rPr>
+      </w:pPr>
     </w:p>
     <w:p>
       <w:pPr>
@@ -537,6 +456,7 @@
           <w:bCs/>
           <w:lang w:val="en-US"/>
         </w:rPr>
+        <w:lastRenderedPageBreak/>
         <w:t>Cart badge reflects the number of items added</w:t>
       </w:r>
     </w:p>
@@ -555,7 +475,6 @@
           <w:bCs/>
           <w:lang w:val="en-US"/>
         </w:rPr>
-        <w:lastRenderedPageBreak/>
         <w:t>Status: PASS</w:t>
       </w:r>
     </w:p>
@@ -622,21 +541,7 @@
         <w:rPr>
           <w:lang w:val="en-US"/>
         </w:rPr>
-        <w:t xml:space="preserve">        And I </w:t>
-      </w:r>
-      <w:proofErr w:type="gramStart"/>
-      <w:r>
-        <w:rPr>
-          <w:lang w:val="en-US"/>
-        </w:rPr>
-        <w:t>add</w:t>
-      </w:r>
-      <w:proofErr w:type="gramEnd"/>
-      <w:r>
-        <w:rPr>
-          <w:lang w:val="en-US"/>
-        </w:rPr>
-        <w:t xml:space="preserve"> the first item to the cart</w:t>
+        <w:t xml:space="preserve">        And I add the first item to the cart</w:t>
       </w:r>
     </w:p>
     <w:p>
@@ -692,21 +597,7 @@
         <w:rPr>
           <w:lang w:val="en-US"/>
         </w:rPr>
-        <w:t xml:space="preserve">        And I </w:t>
-      </w:r>
-      <w:proofErr w:type="gramStart"/>
-      <w:r>
-        <w:rPr>
-          <w:lang w:val="en-US"/>
-        </w:rPr>
-        <w:t>add</w:t>
-      </w:r>
-      <w:proofErr w:type="gramEnd"/>
-      <w:r>
-        <w:rPr>
-          <w:lang w:val="en-US"/>
-        </w:rPr>
-        <w:t xml:space="preserve"> the first item to the cart</w:t>
+        <w:t xml:space="preserve">        And I add the first item to the cart</w:t>
       </w:r>
     </w:p>
     <w:p>
@@ -827,63 +718,11 @@
         </w:rPr>
         <w:t xml:space="preserve">Command: </w:t>
       </w:r>
-      <w:proofErr w:type="spellStart"/>
-      <w:r>
-        <w:rPr>
-          <w:lang w:val="en-US"/>
-        </w:rPr>
-        <w:t>mvn</w:t>
-      </w:r>
-      <w:proofErr w:type="spellEnd"/>
-      <w:r>
-        <w:rPr>
-          <w:lang w:val="en-US"/>
-        </w:rPr>
-        <w:t xml:space="preserve"> test -</w:t>
-      </w:r>
-      <w:proofErr w:type="spellStart"/>
-      <w:r>
-        <w:rPr>
-          <w:lang w:val="en-US"/>
-        </w:rPr>
-        <w:t>Dtest</w:t>
-      </w:r>
-      <w:proofErr w:type="spellEnd"/>
-      <w:r>
-        <w:rPr>
-          <w:lang w:val="en-US"/>
-        </w:rPr>
-        <w:t>=</w:t>
-      </w:r>
-      <w:proofErr w:type="spellStart"/>
-      <w:r>
-        <w:rPr>
-          <w:lang w:val="en-US"/>
-        </w:rPr>
-        <w:t>RunCucumberTest</w:t>
-      </w:r>
-      <w:proofErr w:type="spellEnd"/>
-      <w:r>
-        <w:rPr>
-          <w:lang w:val="en-US"/>
-        </w:rPr>
-        <w:t xml:space="preserve"> -</w:t>
-      </w:r>
-      <w:proofErr w:type="spellStart"/>
-      <w:proofErr w:type="gramStart"/>
-      <w:r>
-        <w:rPr>
-          <w:lang w:val="en-US"/>
-        </w:rPr>
-        <w:t>Dcucumber.filter.tags</w:t>
-      </w:r>
-      <w:proofErr w:type="spellEnd"/>
-      <w:proofErr w:type="gramEnd"/>
-      <w:r>
-        <w:rPr>
-          <w:lang w:val="en-US"/>
-        </w:rPr>
-        <w:t>=@regression</w:t>
+      <w:r>
+        <w:rPr>
+          <w:lang w:val="en-US"/>
+        </w:rPr>
+        <w:t>mvn test -Dtest=RunCucumberTest -Dcucumber.filter.tags=@regression</w:t>
       </w:r>
     </w:p>
     <w:p>
@@ -979,21 +818,7 @@
         <w:rPr>
           <w:lang w:val="en-US"/>
         </w:rPr>
-        <w:t xml:space="preserve">        And I </w:t>
-      </w:r>
-      <w:proofErr w:type="gramStart"/>
-      <w:r>
-        <w:rPr>
-          <w:lang w:val="en-US"/>
-        </w:rPr>
-        <w:t>add</w:t>
-      </w:r>
-      <w:proofErr w:type="gramEnd"/>
-      <w:r>
-        <w:rPr>
-          <w:lang w:val="en-US"/>
-        </w:rPr>
-        <w:t xml:space="preserve"> the first item to the cart</w:t>
+        <w:t xml:space="preserve">        And I add the first item to the cart</w:t>
       </w:r>
     </w:p>
     <w:p>
@@ -1085,7 +910,6 @@
         <w:rPr>
           <w:lang w:val="en-US"/>
         </w:rPr>
-        <w:lastRenderedPageBreak/>
         <w:t xml:space="preserve">    Examples:</w:t>
       </w:r>
     </w:p>
@@ -1126,14 +950,7 @@
         <w:rPr>
           <w:lang w:val="en-US"/>
         </w:rPr>
-        <w:t xml:space="preserve">        | </w:t>
-      </w:r>
-      <w:proofErr w:type="gramStart"/>
-      <w:r>
-        <w:rPr>
-          <w:lang w:val="en-US"/>
-        </w:rPr>
-        <w:t xml:space="preserve">headphones </w:t>
+        <w:t xml:space="preserve">        | headphones </w:t>
       </w:r>
       <w:r>
         <w:rPr>
@@ -1147,7 +964,6 @@
         </w:rPr>
         <w:tab/>
       </w:r>
-      <w:proofErr w:type="gramEnd"/>
       <w:r>
         <w:rPr>
           <w:lang w:val="en-US"/>
@@ -1377,21 +1193,7 @@
         <w:rPr>
           <w:lang w:val="en-US"/>
         </w:rPr>
-        <w:t xml:space="preserve">        Then the cart has </w:t>
-      </w:r>
-      <w:proofErr w:type="gramStart"/>
-      <w:r>
-        <w:rPr>
-          <w:lang w:val="en-US"/>
-        </w:rPr>
-        <w:t>0 line</w:t>
-      </w:r>
-      <w:proofErr w:type="gramEnd"/>
-      <w:r>
-        <w:rPr>
-          <w:lang w:val="en-US"/>
-        </w:rPr>
-        <w:t xml:space="preserve"> item</w:t>
+        <w:t xml:space="preserve">        Then the cart has 0 line item</w:t>
       </w:r>
     </w:p>
     <w:p>
@@ -1500,31 +1302,18 @@
     <w:p>
       <w:pPr>
         <w:rPr>
-          <w:lang w:val="en-US"/>
-        </w:rPr>
-      </w:pPr>
-    </w:p>
-    <w:p>
-      <w:pPr>
-        <w:rPr>
-          <w:lang w:val="en-US"/>
-        </w:rPr>
-      </w:pPr>
-    </w:p>
-    <w:p>
-      <w:pPr>
-        <w:rPr>
-          <w:b/>
-          <w:bCs/>
-          <w:lang w:val="en-US"/>
-        </w:rPr>
-      </w:pPr>
-      <w:r>
-        <w:rPr>
-          <w:b/>
-          <w:bCs/>
-          <w:lang w:val="en-US"/>
-        </w:rPr>
+          <w:b/>
+          <w:bCs/>
+          <w:lang w:val="en-US"/>
+        </w:rPr>
+      </w:pPr>
+      <w:r>
+        <w:rPr>
+          <w:b/>
+          <w:bCs/>
+          <w:lang w:val="en-US"/>
+        </w:rPr>
+        <w:lastRenderedPageBreak/>
         <w:t>Negative Tests:</w:t>
       </w:r>
     </w:p>
@@ -1542,63 +1331,11 @@
         </w:rPr>
         <w:t xml:space="preserve">Command: </w:t>
       </w:r>
-      <w:proofErr w:type="spellStart"/>
-      <w:r>
-        <w:rPr>
-          <w:lang w:val="en-US"/>
-        </w:rPr>
-        <w:t>mvn</w:t>
-      </w:r>
-      <w:proofErr w:type="spellEnd"/>
-      <w:r>
-        <w:rPr>
-          <w:lang w:val="en-US"/>
-        </w:rPr>
-        <w:t xml:space="preserve"> test -</w:t>
-      </w:r>
-      <w:proofErr w:type="spellStart"/>
-      <w:r>
-        <w:rPr>
-          <w:lang w:val="en-US"/>
-        </w:rPr>
-        <w:t>Dtest</w:t>
-      </w:r>
-      <w:proofErr w:type="spellEnd"/>
-      <w:r>
-        <w:rPr>
-          <w:lang w:val="en-US"/>
-        </w:rPr>
-        <w:t>=</w:t>
-      </w:r>
-      <w:proofErr w:type="spellStart"/>
-      <w:r>
-        <w:rPr>
-          <w:lang w:val="en-US"/>
-        </w:rPr>
-        <w:t>RunCucumberTest</w:t>
-      </w:r>
-      <w:proofErr w:type="spellEnd"/>
-      <w:r>
-        <w:rPr>
-          <w:lang w:val="en-US"/>
-        </w:rPr>
-        <w:t xml:space="preserve"> -</w:t>
-      </w:r>
-      <w:proofErr w:type="spellStart"/>
-      <w:proofErr w:type="gramStart"/>
-      <w:r>
-        <w:rPr>
-          <w:lang w:val="en-US"/>
-        </w:rPr>
-        <w:t>Dcucumber.filter.tags</w:t>
-      </w:r>
-      <w:proofErr w:type="spellEnd"/>
-      <w:proofErr w:type="gramEnd"/>
-      <w:r>
-        <w:rPr>
-          <w:lang w:val="en-US"/>
-        </w:rPr>
-        <w:t>=@negative</w:t>
+      <w:r>
+        <w:rPr>
+          <w:lang w:val="en-US"/>
+        </w:rPr>
+        <w:t>mvn test -Dtest=RunCucumberTest -Dcucumber.filter.tags=@negative</w:t>
       </w:r>
     </w:p>
     <w:p>
@@ -1672,15 +1409,7 @@
       </w:r>
       <w:r>
         <w:br/>
-        <w:t xml:space="preserve">    And the first product title is "Noise </w:t>
-      </w:r>
-      <w:proofErr w:type="spellStart"/>
-      <w:r>
-        <w:t>Canceling</w:t>
-      </w:r>
-      <w:proofErr w:type="spellEnd"/>
-      <w:r>
-        <w:t xml:space="preserve"> Headphones"</w:t>
+        <w:t xml:space="preserve">    And the first product title is "Noise Canceling Headphones"</w:t>
       </w:r>
       <w:r>
         <w:br/>
@@ -1688,15 +1417,7 @@
       </w:r>
       <w:r>
         <w:br/>
-        <w:t xml:space="preserve">    And the </w:t>
-      </w:r>
-      <w:proofErr w:type="spellStart"/>
-      <w:r>
-        <w:t>catalog</w:t>
-      </w:r>
-      <w:proofErr w:type="spellEnd"/>
-      <w:r>
-        <w:t xml:space="preserve"> is open</w:t>
+        <w:t xml:space="preserve">    And the catalog is open</w:t>
       </w:r>
       <w:r>
         <w:br/>
@@ -1780,7 +1501,10 @@
       </w:r>
       <w:r>
         <w:tab/>
-        <w:t>: 1</w:t>
+        <w:t xml:space="preserve">: </w:t>
+      </w:r>
+      <w:r>
+        <w:t>1</w:t>
       </w:r>
     </w:p>
     <w:p>
@@ -1792,7 +1516,10 @@
       </w:r>
       <w:r>
         <w:tab/>
-        <w:t>: 2</w:t>
+        <w:t xml:space="preserve">: </w:t>
+      </w:r>
+      <w:r>
+        <w:t>2</w:t>
       </w:r>
     </w:p>
     <w:p>
@@ -1871,6 +1598,7 @@
           <w:sz w:val="32"/>
           <w:szCs w:val="32"/>
         </w:rPr>
+        <w:lastRenderedPageBreak/>
         <w:t>Reports</w:t>
       </w:r>
     </w:p>
@@ -1908,23 +1636,7 @@
           <w:b/>
           <w:bCs/>
         </w:rPr>
-        <w:t>Path: SeleniumWeek3Assignment/test-output/</w:t>
-      </w:r>
-      <w:proofErr w:type="spellStart"/>
-      <w:r>
-        <w:rPr>
-          <w:b/>
-          <w:bCs/>
-        </w:rPr>
-        <w:t>SparkReport</w:t>
-      </w:r>
-      <w:proofErr w:type="spellEnd"/>
-      <w:r>
-        <w:rPr>
-          <w:b/>
-          <w:bCs/>
-        </w:rPr>
-        <w:t>/Spark.html</w:t>
+        <w:t>Path: SeleniumWeek3Assignment/test-output/SparkReport/Spark.html</w:t>
       </w:r>
     </w:p>
     <w:p>

</xml_diff>